<commit_message>
Update leave management system
</commit_message>
<xml_diff>
--- a/“Lab Section_Leave Application System.docx
+++ b/“Lab Section_Leave Application System.docx
@@ -673,7 +673,7 @@
             <w:pPr>
               <w:spacing w:line="276" w:lineRule="auto"/>
               <w:rPr>
-                <w:rFonts w:ascii="Times New Roman" w:hAnsi="Times New Roman" w:cs="Times New Roman" w:hint="eastAsia"/>
+                <w:rFonts w:ascii="Times New Roman" w:hAnsi="Times New Roman" w:cs="Times New Roman"/>
               </w:rPr>
             </w:pPr>
           </w:p>
@@ -705,14 +705,20 @@
           <w:p>
             <w:pPr>
               <w:rPr>
+                <w:rFonts w:ascii="Times New Roman" w:hAnsi="Times New Roman" w:cs="Times New Roman"/>
+              </w:rPr>
+            </w:pPr>
+            <w:r>
+              <w:rPr>
                 <w:rFonts w:ascii="Times New Roman" w:hAnsi="Times New Roman" w:cs="Times New Roman" w:hint="eastAsia"/>
               </w:rPr>
-            </w:pPr>
+              <w:t xml:space="preserve">Person </w:t>
+            </w:r>
             <w:r>
               <w:rPr>
                 <w:rFonts w:ascii="Times New Roman" w:hAnsi="Times New Roman" w:cs="Times New Roman" w:hint="eastAsia"/>
               </w:rPr>
-              <w:t>Person A</w:t>
+              <w:t>B</w:t>
             </w:r>
           </w:p>
         </w:tc>
@@ -899,77 +905,77 @@
             <w:pPr>
               <w:ind w:left="720"/>
               <w:rPr>
+                <w:rFonts w:ascii="Times New Roman" w:hAnsi="Times New Roman" w:cs="Times New Roman"/>
+              </w:rPr>
+            </w:pPr>
+            <w:r>
+              <w:rPr>
                 <w:rFonts w:ascii="Times New Roman" w:hAnsi="Times New Roman" w:cs="Times New Roman" w:hint="eastAsia"/>
               </w:rPr>
-            </w:pPr>
+              <w:t>(</w:t>
+            </w:r>
             <w:r>
               <w:rPr>
                 <w:rFonts w:ascii="Times New Roman" w:hAnsi="Times New Roman" w:cs="Times New Roman" w:hint="eastAsia"/>
               </w:rPr>
-              <w:t>(</w:t>
+              <w:t>这个如果你不会加你们可以</w:t>
             </w:r>
             <w:r>
               <w:rPr>
                 <w:rFonts w:ascii="Times New Roman" w:hAnsi="Times New Roman" w:cs="Times New Roman" w:hint="eastAsia"/>
               </w:rPr>
-              <w:t>这个如果你不会加你们可以</w:t>
+              <w:t>code</w:t>
             </w:r>
             <w:r>
               <w:rPr>
                 <w:rFonts w:ascii="Times New Roman" w:hAnsi="Times New Roman" w:cs="Times New Roman" w:hint="eastAsia"/>
               </w:rPr>
-              <w:t>code</w:t>
-            </w:r>
+              <w:t>好了拿到想要的</w:t>
+            </w:r>
+            <w:proofErr w:type="spellStart"/>
             <w:r>
               <w:rPr>
                 <w:rFonts w:ascii="Times New Roman" w:hAnsi="Times New Roman" w:cs="Times New Roman" w:hint="eastAsia"/>
               </w:rPr>
-              <w:t>好了拿到想要的</w:t>
-            </w:r>
-            <w:proofErr w:type="spellStart"/>
+              <w:t>ui</w:t>
+            </w:r>
+            <w:proofErr w:type="spellEnd"/>
             <w:r>
               <w:rPr>
                 <w:rFonts w:ascii="Times New Roman" w:hAnsi="Times New Roman" w:cs="Times New Roman" w:hint="eastAsia"/>
               </w:rPr>
-              <w:t>ui</w:t>
-            </w:r>
-            <w:proofErr w:type="spellEnd"/>
+              <w:t xml:space="preserve"> </w:t>
+            </w:r>
             <w:r>
               <w:rPr>
                 <w:rFonts w:ascii="Times New Roman" w:hAnsi="Times New Roman" w:cs="Times New Roman" w:hint="eastAsia"/>
               </w:rPr>
-              <w:t xml:space="preserve"> </w:t>
+              <w:t>我帮你们弄</w:t>
             </w:r>
             <w:r>
               <w:rPr>
                 <w:rFonts w:ascii="Times New Roman" w:hAnsi="Times New Roman" w:cs="Times New Roman" w:hint="eastAsia"/>
               </w:rPr>
-              <w:t>我帮你们弄</w:t>
-            </w:r>
+              <w:t xml:space="preserve">) </w:t>
+            </w:r>
+          </w:p>
+          <w:p>
+            <w:pPr>
+              <w:rPr>
+                <w:rFonts w:ascii="Times New Roman" w:hAnsi="Times New Roman" w:cs="Times New Roman"/>
+              </w:rPr>
+            </w:pPr>
+          </w:p>
+          <w:p>
+            <w:pPr>
+              <w:rPr>
+                <w:rFonts w:ascii="Times New Roman" w:hAnsi="Times New Roman" w:cs="Times New Roman"/>
+              </w:rPr>
+            </w:pPr>
             <w:r>
               <w:rPr>
                 <w:rFonts w:ascii="Times New Roman" w:hAnsi="Times New Roman" w:cs="Times New Roman" w:hint="eastAsia"/>
               </w:rPr>
-              <w:t xml:space="preserve">) </w:t>
-            </w:r>
-          </w:p>
-          <w:p>
-            <w:pPr>
-              <w:rPr>
-                <w:rFonts w:ascii="Times New Roman" w:hAnsi="Times New Roman" w:cs="Times New Roman" w:hint="eastAsia"/>
-              </w:rPr>
-            </w:pPr>
-          </w:p>
-          <w:p>
-            <w:pPr>
-              <w:rPr>
-                <w:rFonts w:ascii="Times New Roman" w:hAnsi="Times New Roman" w:cs="Times New Roman"/>
-              </w:rPr>
-            </w:pPr>
-            <w:r>
-              <w:rPr>
-                <w:rFonts w:ascii="Times New Roman" w:hAnsi="Times New Roman" w:cs="Times New Roman" w:hint="eastAsia"/>
-              </w:rPr>
               <w:t xml:space="preserve">3) </w:t>
             </w:r>
             <w:r>
@@ -982,7 +988,7 @@
           <w:p>
             <w:pPr>
               <w:rPr>
-                <w:rFonts w:ascii="Times New Roman" w:hAnsi="Times New Roman" w:cs="Times New Roman" w:hint="eastAsia"/>
+                <w:rFonts w:ascii="Times New Roman" w:hAnsi="Times New Roman" w:cs="Times New Roman"/>
               </w:rPr>
             </w:pPr>
           </w:p>
@@ -1021,7 +1027,7 @@
               <w:rPr>
                 <w:rFonts w:ascii="Times New Roman" w:hAnsi="Times New Roman" w:cs="Times New Roman" w:hint="eastAsia"/>
               </w:rPr>
-              <w:t>Person B</w:t>
+              <w:t>Jiayin</w:t>
             </w:r>
           </w:p>
         </w:tc>
@@ -1091,7 +1097,7 @@
           <w:p>
             <w:pPr>
               <w:rPr>
-                <w:rFonts w:ascii="Times New Roman" w:hAnsi="Times New Roman" w:cs="Times New Roman" w:hint="eastAsia"/>
+                <w:rFonts w:ascii="Times New Roman" w:hAnsi="Times New Roman" w:cs="Times New Roman"/>
               </w:rPr>
             </w:pPr>
             <w:r>
@@ -1334,7 +1340,7 @@
           <w:p>
             <w:pPr>
               <w:rPr>
-                <w:rFonts w:ascii="Times New Roman" w:hAnsi="Times New Roman" w:cs="Times New Roman" w:hint="eastAsia"/>
+                <w:rFonts w:ascii="Times New Roman" w:hAnsi="Times New Roman" w:cs="Times New Roman"/>
               </w:rPr>
             </w:pPr>
           </w:p>
@@ -1367,14 +1373,20 @@
           <w:p>
             <w:pPr>
               <w:rPr>
+                <w:rFonts w:ascii="Times New Roman" w:hAnsi="Times New Roman" w:cs="Times New Roman"/>
+              </w:rPr>
+            </w:pPr>
+            <w:r>
+              <w:rPr>
                 <w:rFonts w:ascii="Times New Roman" w:hAnsi="Times New Roman" w:cs="Times New Roman" w:hint="eastAsia"/>
               </w:rPr>
-            </w:pPr>
+              <w:t xml:space="preserve">Person </w:t>
+            </w:r>
             <w:r>
               <w:rPr>
                 <w:rFonts w:ascii="Times New Roman" w:hAnsi="Times New Roman" w:cs="Times New Roman" w:hint="eastAsia"/>
               </w:rPr>
-              <w:t>Person C</w:t>
+              <w:t>D</w:t>
             </w:r>
           </w:p>
         </w:tc>
@@ -1385,19 +1397,19 @@
           <w:p>
             <w:pPr>
               <w:rPr>
+                <w:rFonts w:ascii="Times New Roman" w:hAnsi="Times New Roman" w:cs="Times New Roman"/>
+              </w:rPr>
+            </w:pPr>
+            <w:r>
+              <w:rPr>
                 <w:rFonts w:ascii="Times New Roman" w:hAnsi="Times New Roman" w:cs="Times New Roman" w:hint="eastAsia"/>
               </w:rPr>
-            </w:pPr>
+              <w:t xml:space="preserve">1) Create a Flowchart for this Web from user process login to leave approval </w:t>
+            </w:r>
             <w:r>
               <w:rPr>
                 <w:rFonts w:ascii="Times New Roman" w:hAnsi="Times New Roman" w:cs="Times New Roman" w:hint="eastAsia"/>
               </w:rPr>
-              <w:t xml:space="preserve">1) Create a Flowchart for this Web from user process login to leave approval </w:t>
-            </w:r>
-            <w:r>
-              <w:rPr>
-                <w:rFonts w:ascii="Times New Roman" w:hAnsi="Times New Roman" w:cs="Times New Roman" w:hint="eastAsia"/>
-              </w:rPr>
               <w:t>to log out.</w:t>
             </w:r>
           </w:p>
@@ -1405,13 +1417,6 @@
             <w:pPr>
               <w:rPr>
                 <w:rFonts w:ascii="Times New Roman" w:hAnsi="Times New Roman" w:cs="Times New Roman"/>
-              </w:rPr>
-            </w:pPr>
-          </w:p>
-          <w:p>
-            <w:pPr>
-              <w:rPr>
-                <w:rFonts w:ascii="Times New Roman" w:hAnsi="Times New Roman" w:cs="Times New Roman" w:hint="eastAsia"/>
               </w:rPr>
             </w:pPr>
           </w:p>
@@ -1504,26 +1509,14 @@
           <w:p>
             <w:pPr>
               <w:rPr>
+                <w:rFonts w:ascii="Times New Roman" w:hAnsi="Times New Roman" w:cs="Times New Roman"/>
+              </w:rPr>
+            </w:pPr>
+            <w:r>
+              <w:rPr>
                 <w:rFonts w:ascii="Times New Roman" w:hAnsi="Times New Roman" w:cs="Times New Roman" w:hint="eastAsia"/>
               </w:rPr>
-            </w:pPr>
-            <w:r>
-              <w:rPr>
-                <w:rFonts w:ascii="Times New Roman" w:hAnsi="Times New Roman" w:cs="Times New Roman" w:hint="eastAsia"/>
-              </w:rPr>
-              <w:t xml:space="preserve">3) </w:t>
-            </w:r>
-            <w:r>
-              <w:rPr>
-                <w:rFonts w:ascii="Times New Roman" w:hAnsi="Times New Roman" w:cs="Times New Roman" w:hint="eastAsia"/>
-              </w:rPr>
-              <w:t>add forgot passwords (UI)</w:t>
-            </w:r>
-            <w:r>
-              <w:rPr>
-                <w:rFonts w:ascii="Times New Roman" w:hAnsi="Times New Roman" w:cs="Times New Roman" w:hint="eastAsia"/>
-              </w:rPr>
-              <w:t xml:space="preserve"> </w:t>
+              <w:t xml:space="preserve">3) add forgot passwords (UI) </w:t>
             </w:r>
             <w:r>
               <w:rPr>
@@ -1625,24 +1618,13 @@
           <w:tcPr>
             <w:tcW w:w="421" w:type="dxa"/>
           </w:tcPr>
-          <w:p>
-            <w:pPr>
-              <w:rPr>
-                <w:rFonts w:hint="eastAsia"/>
-              </w:rPr>
-            </w:pPr>
-          </w:p>
+          <w:p/>
         </w:tc>
         <w:tc>
           <w:tcPr>
             <w:tcW w:w="2409" w:type="dxa"/>
           </w:tcPr>
           <w:p>
-            <w:pPr>
-              <w:rPr>
-                <w:rFonts w:hint="eastAsia"/>
-              </w:rPr>
-            </w:pPr>
             <w:r>
               <w:rPr>
                 <w:rFonts w:hint="eastAsia"/>
@@ -1660,6 +1642,23 @@
       </w:tr>
     </w:tbl>
     <w:p/>
+    <w:p/>
+    <w:p/>
+    <w:p/>
+    <w:p/>
+    <w:p/>
+    <w:p/>
+    <w:p/>
+    <w:p/>
+    <w:p/>
+    <w:p/>
+    <w:p/>
+    <w:p/>
+    <w:p/>
+    <w:p/>
+    <w:p/>
+    <w:p/>
+    <w:p/>
     <w:p>
       <w:pPr>
         <w:pStyle w:val="Heading1"/>
@@ -1668,6 +1667,7 @@
         <w:rPr>
           <w:rFonts w:hint="eastAsia"/>
         </w:rPr>
+        <w:lastRenderedPageBreak/>
         <w:t>Introduction</w:t>
       </w:r>
     </w:p>
@@ -1675,7 +1675,7 @@
       <w:pPr>
         <w:spacing w:line="360" w:lineRule="auto"/>
         <w:rPr>
-          <w:rFonts w:ascii="Times New Roman" w:hAnsi="Times New Roman" w:cs="Times New Roman"/>
+          <w:rFonts w:ascii="Times New Roman" w:hAnsi="Times New Roman" w:cs="Times New Roman" w:hint="eastAsia"/>
         </w:rPr>
       </w:pPr>
       <w:r>
@@ -1726,7 +1726,13 @@
         <w:rPr>
           <w:rFonts w:ascii="Times New Roman" w:hAnsi="Times New Roman" w:cs="Times New Roman"/>
         </w:rPr>
-        <w:t xml:space="preserve"> Solutions, located in Kuala Lumpur, Malaysia.</w:t>
+        <w:t xml:space="preserve"> Solutions</w:t>
+      </w:r>
+      <w:r>
+        <w:rPr>
+          <w:rFonts w:ascii="Times New Roman" w:hAnsi="Times New Roman" w:cs="Times New Roman" w:hint="eastAsia"/>
+        </w:rPr>
+        <w:t>.</w:t>
       </w:r>
     </w:p>
     <w:p>
@@ -1833,7 +1839,6 @@
         <w:pStyle w:val="Heading1"/>
       </w:pPr>
       <w:r>
-        <w:lastRenderedPageBreak/>
         <w:t>Objectives</w:t>
       </w:r>
     </w:p>
@@ -1941,6 +1946,7 @@
         <w:rPr>
           <w:rFonts w:ascii="Times New Roman" w:hAnsi="Times New Roman" w:cs="Times New Roman"/>
         </w:rPr>
+        <w:lastRenderedPageBreak/>
         <w:t xml:space="preserve">In addition, the system includes a </w:t>
       </w:r>
       <w:r>
@@ -2092,7 +2098,6 @@
         <w:rPr>
           <w:rFonts w:ascii="Times New Roman" w:hAnsi="Times New Roman" w:cs="Times New Roman"/>
         </w:rPr>
-        <w:lastRenderedPageBreak/>
         <w:t>2.2 Transition from Design to Development</w:t>
       </w:r>
     </w:p>
@@ -2164,6 +2169,7 @@
         <w:rPr>
           <w:rFonts w:ascii="Times New Roman" w:hAnsi="Times New Roman" w:cs="Times New Roman"/>
         </w:rPr>
+        <w:lastRenderedPageBreak/>
         <w:t>NexusLeave</w:t>
       </w:r>
       <w:proofErr w:type="spellEnd"/>
@@ -4039,6 +4045,7 @@
   <w:style w:type="character" w:default="1" w:styleId="DefaultParagraphFont">
     <w:name w:val="Default Paragraph Font"/>
     <w:uiPriority w:val="1"/>
+    <w:semiHidden/>
     <w:unhideWhenUsed/>
   </w:style>
   <w:style w:type="table" w:default="1" w:styleId="TableNormal">

</xml_diff>